<commit_message>
docs: add real state discovery and autonomous sequence final test to Lab 03 and ABET instrument
</commit_message>
<xml_diff>
--- a/education/evidencias_abet/INSTRUMENTO_ABET_LAB_03_OPERACION_DISTRIBUIDA_KINOVA_TURNOS.docx
+++ b/education/evidencias_abet/INSTRUMENTO_ABET_LAB_03_OPERACION_DISTRIBUIDA_KINOVA_TURNOS.docx
@@ -5358,7 +5358,7 @@
         <w:rPr>
           <w:b/>
         </w:rPr>
-        <w:t>Tabla 4: Registro de Turnos de Movimiento Articular en joint_6 (Fase 3)</w:t>
+        <w:t>Tabla 4: Registro de Turnos de Movimiento Articular y Prueba Final (Fase 3)</w:t>
       </w:r>
     </w:p>
     <w:tbl>
@@ -6553,6 +6553,207 @@
                 <w:b w:val="0"/>
                 <w:sz w:val="15"/>
               </w:rPr>
+            </w:r>
+          </w:p>
+        </w:tc>
+      </w:tr>
+      <w:tr>
+        <w:tc>
+          <w:tcPr>
+            <w:tcW w:type="dxa" w:w="680"/>
+            <w:shd w:fill="F2F2F2"/>
+            <w:vAlign w:val="center"/>
+          </w:tcPr>
+          <w:p>
+            <w:pPr>
+              <w:spacing w:after="0" w:before="0"/>
+            </w:pPr>
+            <w:r>
+              <w:rPr>
+                <w:rFonts w:ascii="Arial" w:hAnsi="Arial"/>
+                <w:b w:val="0"/>
+                <w:sz w:val="15"/>
+              </w:rPr>
+              <w:t>Prueba Final</w:t>
+            </w:r>
+          </w:p>
+        </w:tc>
+        <w:tc>
+          <w:tcPr>
+            <w:tcW w:type="dxa" w:w="737"/>
+            <w:shd w:fill="F2F2F2"/>
+            <w:vAlign w:val="center"/>
+          </w:tcPr>
+          <w:p>
+            <w:pPr>
+              <w:spacing w:after="0" w:before="0"/>
+            </w:pPr>
+            <w:r>
+              <w:rPr>
+                <w:rFonts w:ascii="Arial" w:hAnsi="Arial"/>
+                <w:b w:val="0"/>
+                <w:sz w:val="15"/>
+              </w:rPr>
+              <w:t>Todos</w:t>
+            </w:r>
+          </w:p>
+        </w:tc>
+        <w:tc>
+          <w:tcPr>
+            <w:tcW w:type="dxa" w:w="794"/>
+            <w:shd w:fill="F2F2F2"/>
+            <w:vAlign w:val="center"/>
+          </w:tcPr>
+          <w:p>
+            <w:pPr>
+              <w:spacing w:after="0" w:before="0"/>
+            </w:pPr>
+            <w:r>
+              <w:rPr>
+                <w:rFonts w:ascii="Arial" w:hAnsi="Arial"/>
+                <w:b w:val="0"/>
+                <w:sz w:val="15"/>
+              </w:rPr>
+            </w:r>
+          </w:p>
+        </w:tc>
+        <w:tc>
+          <w:tcPr>
+            <w:tcW w:type="dxa" w:w="1304"/>
+            <w:shd w:fill="F2F2F2"/>
+            <w:vAlign w:val="center"/>
+          </w:tcPr>
+          <w:p>
+            <w:pPr>
+              <w:spacing w:after="0" w:before="0"/>
+            </w:pPr>
+            <w:r>
+              <w:rPr>
+                <w:rFonts w:ascii="Arial" w:hAnsi="Arial"/>
+                <w:b w:val="0"/>
+                <w:sz w:val="15"/>
+              </w:rPr>
+              <w:t>Origen autodescubierto</w:t>
+            </w:r>
+          </w:p>
+        </w:tc>
+        <w:tc>
+          <w:tcPr>
+            <w:tcW w:type="dxa" w:w="1361"/>
+            <w:shd w:fill="F2F2F2"/>
+            <w:vAlign w:val="center"/>
+          </w:tcPr>
+          <w:p>
+            <w:pPr>
+              <w:spacing w:after="0" w:before="0"/>
+            </w:pPr>
+            <w:r>
+              <w:rPr>
+                <w:rFonts w:ascii="Arial" w:hAnsi="Arial"/>
+                <w:b w:val="0"/>
+                <w:sz w:val="15"/>
+              </w:rPr>
+              <w:t>Coreografía 25 deltas</w:t>
+            </w:r>
+          </w:p>
+        </w:tc>
+        <w:tc>
+          <w:tcPr>
+            <w:tcW w:type="dxa" w:w="1134"/>
+            <w:shd w:fill="F2F2F2"/>
+            <w:vAlign w:val="center"/>
+          </w:tcPr>
+          <w:p>
+            <w:pPr>
+              <w:spacing w:after="0" w:before="0"/>
+            </w:pPr>
+            <w:r>
+              <w:rPr>
+                <w:rFonts w:ascii="Arial" w:hAnsi="Arial"/>
+                <w:b w:val="0"/>
+                <w:sz w:val="15"/>
+              </w:rPr>
+              <w:t>0 (Éxito)</w:t>
+            </w:r>
+          </w:p>
+        </w:tc>
+        <w:tc>
+          <w:tcPr>
+            <w:tcW w:type="dxa" w:w="1134"/>
+            <w:shd w:fill="F2F2F2"/>
+            <w:vAlign w:val="center"/>
+          </w:tcPr>
+          <w:p>
+            <w:pPr>
+              <w:spacing w:after="0" w:before="0"/>
+            </w:pPr>
+            <w:r>
+              <w:rPr>
+                <w:rFonts w:ascii="Arial" w:hAnsi="Arial"/>
+                <w:b w:val="0"/>
+                <w:sz w:val="15"/>
+              </w:rPr>
+              <w:t>SUCCESSFUL</w:t>
+            </w:r>
+          </w:p>
+        </w:tc>
+        <w:tc>
+          <w:tcPr>
+            <w:tcW w:type="dxa" w:w="1247"/>
+            <w:shd w:fill="F2F2F2"/>
+            <w:vAlign w:val="center"/>
+          </w:tcPr>
+          <w:p>
+            <w:pPr>
+              <w:spacing w:after="0" w:before="0"/>
+            </w:pPr>
+            <w:r>
+              <w:rPr>
+                <w:rFonts w:ascii="Arial" w:hAnsi="Arial"/>
+                <w:b w:val="0"/>
+                <w:sz w:val="15"/>
+              </w:rPr>
+              <w:t>Retorno origen</w:t>
+            </w:r>
+          </w:p>
+        </w:tc>
+        <w:tc>
+          <w:tcPr>
+            <w:tcW w:type="dxa" w:w="964"/>
+            <w:shd w:fill="F2F2F2"/>
+            <w:vAlign w:val="center"/>
+          </w:tcPr>
+          <w:p>
+            <w:pPr>
+              <w:spacing w:after="0" w:before="0"/>
+            </w:pPr>
+            <w:r>
+              <w:rPr>
+                <w:rFonts w:ascii="Arial" w:hAnsi="Arial"/>
+                <w:b w:val="0"/>
+                <w:sz w:val="15"/>
+              </w:rPr>
+              <w:t>0.000</w:t>
+            </w:r>
+          </w:p>
+        </w:tc>
+        <w:tc>
+          <w:tcPr>
+            <w:tcW w:type="dxa" w:w="567"/>
+            <w:shd w:fill="F2F2F2"/>
+            <w:vAlign w:val="center"/>
+          </w:tcPr>
+          <w:p>
+            <w:pPr>
+              <w:spacing w:after="0" w:before="0"/>
+            </w:pPr>
+            <w:r>
+              <w:rPr>
+                <w:rFonts w:ascii="Arial" w:hAnsi="Arial"/>
+                <w:b w:val="0"/>
+                <w:sz w:val="15"/>
+              </w:rPr>
+              <w:t>OK</w:t>
             </w:r>
           </w:p>
         </w:tc>
@@ -7309,6 +7510,57 @@
         <w:t>Pregunta 7: Aislamiento vs. Colaboración en DDS (Impacto del ROS_DOMAIN_ID)</w:t>
         <w:br/>
         <w:t>¿Qué ocurriría si un equipo olvida configurar el ROS_DOMAIN_ID=0 y ejecuta su monitor en el dominio por defecto (ROS_DOMAIN_ID=10)? ¿Podría recibir telemetría o enviar trayectorias al Kinova? Explique por qué el dominio común es condición matemática necesaria.</w:t>
+      </w:r>
+    </w:p>
+    <w:tbl>
+      <w:tblPr>
+        <w:tblStyle w:val="TableGrid"/>
+        <w:tblW w:type="auto" w:w="0"/>
+        <w:jc w:val="center"/>
+        <w:tblLook w:firstColumn="1" w:firstRow="1" w:lastColumn="0" w:lastRow="0" w:noHBand="0" w:noVBand="1" w:val="04A0"/>
+      </w:tblPr>
+      <w:tblGrid>
+        <w:gridCol w:w="10312"/>
+      </w:tblGrid>
+      <w:tr>
+        <w:tc>
+          <w:tcPr>
+            <w:tcW w:type="dxa" w:w="9921"/>
+            <w:shd w:fill="FAFAFA"/>
+          </w:tcPr>
+          <w:p>
+            <w:pPr>
+              <w:spacing w:before="40" w:after="40"/>
+            </w:pPr>
+            <w:r>
+              <w:rPr>
+                <w:rFonts w:ascii="Arial" w:hAnsi="Arial"/>
+                <w:color w:val="555555"/>
+                <w:sz w:val="16"/>
+              </w:rPr>
+              <w:t>Respuesta Técnica del Equipo:</w:t>
+              <w:br/>
+              <w:br/>
+              <w:br/>
+              <w:br/>
+            </w:r>
+          </w:p>
+        </w:tc>
+      </w:tr>
+    </w:tbl>
+    <w:p>
+      <w:pPr>
+        <w:spacing w:before="80" w:after="40"/>
+      </w:pPr>
+      <w:r>
+        <w:rPr>
+          <w:rFonts w:ascii="Arial" w:hAnsi="Arial"/>
+          <w:i/>
+          <w:sz w:val="17"/>
+        </w:rPr>
+        <w:t>Pregunta 8: Posicionamiento Absoluto vs. Deltas Relativos y Autodescubrimiento de Pose</w:t>
+        <w:br/>
+        <w:t>Compare la operación de safe_trajectory_client frente a safe_sequence_client. ¿Por qué en el cliente individual fue estrictamente necesario descubrir las posiciones absolutas reales de /joint_states antes de formular la meta para evitar el bloqueo por max_joint_delta_rad (0.10 rad), mientras que el cliente de secuencia pudo ejecutarse desde cualquier pose sin transcribir coordenadas a mano? ¿Qué riesgos y ventajas de seguridad introduce cada enfoque en entornos industriales colaborativos?</w:t>
       </w:r>
     </w:p>
     <w:tbl>

</xml_diff>